<commit_message>
feat: add interactive demo, final title ManufacturingPolicyLab, update team info and deps
</commit_message>
<xml_diff>
--- a/AI for reserach开放探索赛初赛文档_重写版_4页版.docx
+++ b/AI for reserach开放探索赛初赛文档_重写版_4页版.docx
@@ -21,10 +21,7 @@
         <w:pStyle w:val="Subtitle"/>
       </w:pPr>
       <w:r>
-        <w:rPr>
-          <w:rFonts w:hint="eastAsia"/>
-        </w:rPr>
-        <w:t xml:space="preserve">美国制造业自动化冲击下的企业异质性与政策沙盒（1990—2020）</w:t>
+        <w:t>ManufacturingPolicyLab：1990—2020 美国制造业自动化冲击的企业异质性政策沙盒</w:t>
       </w:r>
     </w:p>
     <w:p>
@@ -32,10 +29,7 @@
         <w:pStyle w:val="Author"/>
       </w:pPr>
       <w:r>
-        <w:rPr>
-          <w:rFonts w:hint="eastAsia"/>
-        </w:rPr>
-        <w:t xml:space="preserve">团队信息待填写</w:t>
+        <w:t>团队：suppartwang（个人参赛）｜负责人：王艺超</w:t>
       </w:r>
     </w:p>
     <w:p>
@@ -4679,21 +4673,7 @@
         </w:numPr>
       </w:pPr>
       <w:r>
-        <w:rPr>
-          <w:rFonts w:hint="eastAsia"/>
-          <w:b/>
-          <w:bCs/>
-        </w:rPr>
-        <w:t xml:space="preserve">依赖</w:t>
-      </w:r>
-      <w:r>
-        <w:rPr>
-          <w:rFonts w:hint="eastAsia"/>
-        </w:rPr>
-        <w:t xml:space="preserve">：Python</w:t>
-      </w:r>
-      <w:r>
-        <w:t xml:space="preserve"> 3.10+、Mesa 2.4.0、numpy、pandas、matplotlib、seaborn。</w:t>
+        <w:t>依赖：Python 3.10+、Mesa&lt;2.0、numpy、pandas、matplotlib、seaborn、jupyter、ipywidgets。</w:t>
       </w:r>
     </w:p>
     <w:p>
@@ -5228,6 +5208,97 @@
     <w:bookmarkEnd w:id="36"/>
     <w:bookmarkEnd w:id="37"/>
     <w:bookmarkStart w:id="38" w:name="附录证据台账不计入-4-页"/>
+    <w:p>
+      <w:pPr>
+        <w:pStyle w:val="Heading1"/>
+      </w:pPr>
+      <w:r>
+        <w:t>六、可复现 Demo</w:t>
+      </w:r>
+    </w:p>
+    <w:p>
+      <w:pPr>
+        <w:pStyle w:val="Heading2"/>
+      </w:pPr>
+      <w:r>
+        <w:t>6.1 交互式 Jupyter Notebook</w:t>
+      </w:r>
+    </w:p>
+    <w:p>
+      <w:r>
+        <w:t>project/demo/PolicySandbox_Demo.ipynb 提供交互式政策沙盒：通过滑块实时调节失业替代率 u、机器人税收抵免 r、SME 补贴 s，即时观察 1990—2020 年的自动化强度、就业、失业率与平均工资演化。</w:t>
+      </w:r>
+    </w:p>
+    <w:p>
+      <w:pPr>
+        <w:pStyle w:val="Heading2"/>
+      </w:pPr>
+      <w:r>
+        <w:t>6.2 三政策情景动态对比</w:t>
+      </w:r>
+    </w:p>
+    <w:p>
+      <w:r>
+        <w:t>运行 Notebook 第 3 单元可生成 policy_comparison.gif（已保存于 project/figures/），动态展示自由市场、温和干预、强力干预三种情景下的 30 年演化路径，用于答辩与文档插图。</w:t>
+      </w:r>
+    </w:p>
+    <w:p>
+      <w:r>
+        <w:drawing>
+          <wp:inline>
+            <wp:extent cx="5029200" cy="3352800"/>
+            <wp:docPr id="30" name="Picture 30"/>
+            <wp:cNvGraphicFramePr>
+              <a:graphicFrameLocks noChangeAspect="1"/>
+            </wp:cNvGraphicFramePr>
+            <a:graphic>
+              <a:graphicData uri="http://schemas.openxmlformats.org/drawingml/2006/picture">
+                <pic:pic>
+                  <pic:nvPicPr>
+                    <pic:cNvPr id="0" name="policy_comparison.gif"/>
+                    <pic:cNvPicPr/>
+                  </pic:nvPicPr>
+                  <pic:blipFill>
+                    <a:blip r:embed="rId10"/>
+                    <a:stretch>
+                      <a:fillRect/>
+                    </a:stretch>
+                  </pic:blipFill>
+                  <pic:spPr>
+                    <a:xfrm>
+                      <a:off x="0" y="0"/>
+                      <a:ext cx="5029200" cy="3352800"/>
+                    </a:xfrm>
+                    <a:prstGeom prst="rect"/>
+                  </pic:spPr>
+                </pic:pic>
+              </a:graphicData>
+            </a:graphic>
+          </wp:inline>
+        </w:drawing>
+      </w:r>
+    </w:p>
+    <w:p>
+      <w:pPr>
+        <w:pStyle w:val="Caption"/>
+      </w:pPr>
+      <w:r>
+        <w:t>图 5：三政策情景 1990—2020 动态对比。来源：本研究 Mesa 仿真输出（project/figures/policy_comparison.gif）。</w:t>
+      </w:r>
+    </w:p>
+    <w:p>
+      <w:pPr>
+        <w:pStyle w:val="Heading2"/>
+      </w:pPr>
+      <w:r>
+        <w:t>6.3 开源仓库</w:t>
+      </w:r>
+    </w:p>
+    <w:p>
+      <w:r>
+        <w:t>完整代码、数据、结果与可视化已托管于 GitHub：https://github.com/SuppartWang/ai-for-research-open-exploration。</w:t>
+      </w:r>
+    </w:p>
     <w:p>
       <w:pPr>
         <w:pStyle w:val="Heading1"/>

</xml_diff>

<commit_message>
refactor: retitle to Employment Safety Net Lab, focus on employment impact and policy cushioning
</commit_message>
<xml_diff>
--- a/AI for reserach开放探索赛初赛文档_重写版_4页版.docx
+++ b/AI for reserach开放探索赛初赛文档_重写版_4页版.docx
@@ -21,7 +21,7 @@
         <w:pStyle w:val="Subtitle"/>
       </w:pPr>
       <w:r>
-        <w:t>ManufacturingPolicyLab：1990—2020 美国制造业自动化冲击的企业异质性政策沙盒</w:t>
+        <w:t>Employment Safety Net Lab：1990—2020 美国制造业自动化冲击下的就业缓冲政策沙盒</w:t>
       </w:r>
     </w:p>
     <w:p>
@@ -72,19 +72,7 @@
         <w:pStyle w:val="FirstParagraph"/>
       </w:pPr>
       <w:r>
-        <w:rPr>
-          <w:rFonts w:hint="eastAsia"/>
-        </w:rPr>
-        <w:t xml:space="preserve">蒸汽机、电力与信息技术的历史反复表明：重大技术跃迁在提升总产出的同时，也会撕裂就业结构、拉大分配鸿沟。本研究的发心，是在本轮</w:t>
-      </w:r>
-      <w:r>
-        <w:t xml:space="preserve"> AI + </w:t>
-      </w:r>
-      <w:r>
-        <w:rPr>
-          <w:rFonts w:hint="eastAsia"/>
-        </w:rPr>
-        <w:t xml:space="preserve">机器人自动化浪潮尚未完全定型之前，建立一个可试验、可复盘、可对话的“政策沙盒”，避免重蹈前几次生产力大爆发对社会和人民造成的剧烈冲击。</w:t>
+        <w:t>蒸汽机、电力与信息技术的历史反复表明：重大技术跃迁在提升总产出的同时，也会撕裂就业结构、拉大分配鸿沟，并对社会就业者造成真实而剧烈的冲击。本研究的发心，是在本轮 AI + 机器人自动化浪潮尚未完全定型之前，建立一个可试验、可复盘、可对话的“政策沙盒”，探索政府如何通过失业保险、机器人税、SME 补贴等调控工具，构建面向就业者的“安全网”，避免重蹈前几次生产力大爆发对社会和人民造成的剧烈冲击与动荡。</w:t>
       </w:r>
     </w:p>
     <w:p>

</xml_diff>